<commit_message>
Refresh role/ai-tooling-engineer from main (Kantata promotion framing, M-Bridge 2.5 yrs)
Co-Authored-By: Claude Sonnet 5.5 <noreply@anthropic.com>
Claude-Session: https://claude.ai/code/session_01WXGUR3kJapZb77SkmNBF6Y
</commit_message>
<xml_diff>
--- a/resume.docx
+++ b/resume.docx
@@ -2,7 +2,7 @@
 <file path=word/document.xml><?xml version="1.0" encoding="utf-8"?>
 <w:document xmlns:w="http://schemas.openxmlformats.org/wordprocessingml/2006/main" xmlns:m="http://schemas.openxmlformats.org/officeDocument/2006/math" xmlns:r="http://schemas.openxmlformats.org/officeDocument/2006/relationships" xmlns:o="urn:schemas-microsoft-com:office:office" xmlns:v="urn:schemas-microsoft-com:vml" xmlns:w10="urn:schemas-microsoft-com:office:word" xmlns:a="http://schemas.openxmlformats.org/drawingml/2006/main" xmlns:pic="http://schemas.openxmlformats.org/drawingml/2006/picture" xmlns:wp="http://schemas.openxmlformats.org/drawingml/2006/wordprocessingDrawing">
   <w:body>
-    <w:bookmarkStart w:id="39" w:name="jack-senechal"/>
+    <w:bookmarkStart w:id="37" w:name="jack-senechal"/>
     <w:p>
       <w:pPr>
         <w:pStyle w:val="Heading1"/>
@@ -161,7 +161,7 @@
         <w:t xml:space="preserve">AI/LLM hands-on</w:t>
       </w:r>
       <w:r>
-        <w:t xml:space="preserve">: originated an open-source LLM evaluation framework built on AISI Inspect, ships MCP servers, and built a</w:t>
+        <w:t xml:space="preserve">: originated an open-source LLM evaluation framework built on AISI Inspect, ships an MCP server, and built a</w:t>
       </w:r>
       <w:r>
         <w:t xml:space="preserve"> </w:t>
@@ -248,6 +248,39 @@
     </w:p>
     <w:p>
       <w:pPr>
+        <w:pStyle w:val="FirstParagraph"/>
+      </w:pPr>
+      <w:r>
+        <w:rPr>
+          <w:i/>
+          <w:iCs/>
+        </w:rPr>
+        <w:t xml:space="preserve">Scope: designs the delivery process and governance model; owns product and prioritization.</w:t>
+      </w:r>
+    </w:p>
+    <w:p>
+      <w:pPr>
+        <w:pStyle w:val="Compact"/>
+        <w:numPr>
+          <w:ilvl w:val="0"/>
+          <w:numId w:val="1002"/>
+        </w:numPr>
+      </w:pPr>
+      <w:r>
+        <w:t xml:space="preserve">Running</w:t>
+      </w:r>
+      <w:r>
+        <w:t xml:space="preserve"> </w:t>
+      </w:r>
+      <w:r>
+        <w:t xml:space="preserve">“software factories”</w:t>
+      </w:r>
+      <w:r>
+        <w:t xml:space="preserve">: agent-driven delivery pipelines that carry engineering work from spec to shipped, with a human owning the product. Speed without fragility: production-quality output over long-horizon iteration, where agentic development typically falls down.</w:t>
+      </w:r>
+    </w:p>
+    <w:p>
+      <w:pPr>
         <w:pStyle w:val="Compact"/>
         <w:numPr>
           <w:ilvl w:val="0"/>
@@ -259,31 +292,82 @@
           <w:b/>
           <w:bCs/>
         </w:rPr>
-        <w:t xml:space="preserve">Running</w:t>
-      </w:r>
+        <w:t xml:space="preserve">Core thesis</w:t>
+      </w:r>
+      <w:r>
+        <w:t xml:space="preserve">: the same DevOps and project-management discipline that makes human teams work is the necessary and sufficient foundation for agent teams, encoded into the harness and context.</w:t>
+      </w:r>
+    </w:p>
+    <w:p>
+      <w:pPr>
+        <w:pStyle w:val="Compact"/>
+        <w:numPr>
+          <w:ilvl w:val="0"/>
+          <w:numId w:val="1002"/>
+        </w:numPr>
+      </w:pPr>
       <w:r>
         <w:rPr>
           <w:b/>
           <w:bCs/>
         </w:rPr>
-        <w:t xml:space="preserve"> </w:t>
-      </w:r>
+        <w:t xml:space="preserve">GitHub as coordination substrate</w:t>
+      </w:r>
+      <w:r>
+        <w:t xml:space="preserve">: issues, PRs, and Projects as the single ledger. Harness-enforced SDLC (independent fresh-context reviewer, green CI, supply-chain scanning, deployment smoke check) so agents move fast without breaking things.</w:t>
+      </w:r>
+    </w:p>
+    <w:p>
+      <w:pPr>
+        <w:pStyle w:val="Compact"/>
+        <w:numPr>
+          <w:ilvl w:val="0"/>
+          <w:numId w:val="1002"/>
+        </w:numPr>
+      </w:pPr>
       <w:r>
         <w:rPr>
           <w:b/>
           <w:bCs/>
         </w:rPr>
-        <w:t xml:space="preserve">“software factories”</w:t>
-      </w:r>
+        <w:t xml:space="preserve">Self-improving harness</w:t>
+      </w:r>
+      <w:r>
+        <w:t xml:space="preserve">: orchestration agents run, observe, and refine the process, converging on and shipping their own refinements.</w:t>
+      </w:r>
+    </w:p>
+    <w:p>
+      <w:pPr>
+        <w:pStyle w:val="Compact"/>
+        <w:numPr>
+          <w:ilvl w:val="0"/>
+          <w:numId w:val="1002"/>
+        </w:numPr>
+      </w:pPr>
+      <w:r>
+        <w:t xml:space="preserve">Governance built into the system: every change passes an independent reviewer, automated testing, supply-chain security scanning, and a deployment verification step.</w:t>
+      </w:r>
+    </w:p>
+    <w:p>
+      <w:pPr>
+        <w:pStyle w:val="Compact"/>
+        <w:numPr>
+          <w:ilvl w:val="0"/>
+          <w:numId w:val="1002"/>
+        </w:numPr>
+      </w:pPr>
       <w:r>
         <w:rPr>
           <w:b/>
           <w:bCs/>
         </w:rPr>
-        <w:t xml:space="preserve">: agent-driven delivery pipelines that carry engineering work from spec to shipped</w:t>
-      </w:r>
-      <w:r>
-        <w:t xml:space="preserve">, with the human in the product seat.</w:t>
+        <w:t xml:space="preserve">Next.js, Vercel, Cloudflare</w:t>
+      </w:r>
+      <w:r>
+        <w:t xml:space="preserve"> </w:t>
+      </w:r>
+      <w:r>
+        <w:t xml:space="preserve">stack: robust tooling and feedback loops for strong agentic traction.</w:t>
       </w:r>
     </w:p>
     <w:p>
@@ -299,86 +383,10 @@
           <w:b/>
           <w:bCs/>
         </w:rPr>
-        <w:t xml:space="preserve">Core thesis</w:t>
-      </w:r>
-      <w:r>
-        <w:t xml:space="preserve">: the same DevOps and project-management discipline that makes human teams work is also the necessary and sufficient foundation for agent teams, encoded into the harness and context.</w:t>
-      </w:r>
-    </w:p>
-    <w:p>
-      <w:pPr>
-        <w:pStyle w:val="Compact"/>
-        <w:numPr>
-          <w:ilvl w:val="0"/>
-          <w:numId w:val="1002"/>
-        </w:numPr>
-      </w:pPr>
-      <w:r>
-        <w:rPr>
-          <w:b/>
-          <w:bCs/>
-        </w:rPr>
-        <w:t xml:space="preserve">GitHub as the coordination substrate</w:t>
-      </w:r>
-      <w:r>
-        <w:t xml:space="preserve">: issues, PRs, and Projects are the single ledger.</w:t>
-      </w:r>
-    </w:p>
-    <w:p>
-      <w:pPr>
-        <w:pStyle w:val="Compact"/>
-        <w:numPr>
-          <w:ilvl w:val="0"/>
-          <w:numId w:val="1002"/>
-        </w:numPr>
-      </w:pPr>
-      <w:r>
-        <w:rPr>
-          <w:b/>
-          <w:bCs/>
-        </w:rPr>
-        <w:t xml:space="preserve">Harness-enforced SDLC</w:t>
-      </w:r>
-      <w:r>
-        <w:t xml:space="preserve">: PRs gated by independent fresh-context reviewer, green CI, supply-chain scanning, deployment smoke check.</w:t>
-      </w:r>
-    </w:p>
-    <w:p>
-      <w:pPr>
-        <w:pStyle w:val="Compact"/>
-        <w:numPr>
-          <w:ilvl w:val="0"/>
-          <w:numId w:val="1002"/>
-        </w:numPr>
-      </w:pPr>
-      <w:r>
-        <w:rPr>
-          <w:b/>
-          <w:bCs/>
-        </w:rPr>
-        <w:t xml:space="preserve">Self-improving harness</w:t>
-      </w:r>
-      <w:r>
-        <w:t xml:space="preserve">: Orchestration agents tasked with running, observing, and refining the process. Agents collaboratively converge on refinements, ship and evaluate.</w:t>
-      </w:r>
-    </w:p>
-    <w:p>
-      <w:pPr>
-        <w:pStyle w:val="Compact"/>
-        <w:numPr>
-          <w:ilvl w:val="0"/>
-          <w:numId w:val="1002"/>
-        </w:numPr>
-      </w:pPr>
-      <w:r>
-        <w:rPr>
-          <w:b/>
-          <w:bCs/>
-        </w:rPr>
-        <w:t xml:space="preserve">Human in the product role</w:t>
-      </w:r>
-      <w:r>
-        <w:t xml:space="preserve">: defining and prioritizing work, verifying against deployed previews, steering product and process.</w:t>
+        <w:t xml:space="preserve">Product ownership</w:t>
+      </w:r>
+      <w:r>
+        <w:t xml:space="preserve">: rapid prototyping, requirements gathering, defining and prioritizing the work, and verifying output against deployed previews on behalf of a non-technical user base.</w:t>
       </w:r>
     </w:p>
     <w:bookmarkEnd w:id="14"/>
@@ -403,6 +411,18 @@
     </w:p>
     <w:p>
       <w:pPr>
+        <w:pStyle w:val="FirstParagraph"/>
+      </w:pPr>
+      <w:r>
+        <w:rPr>
+          <w:i/>
+          <w:iCs/>
+        </w:rPr>
+        <w:t xml:space="preserve">Scope: technical direction and roadmap for a public benefit corporation’s engineering team.</w:t>
+      </w:r>
+    </w:p>
+    <w:p>
+      <w:pPr>
         <w:pStyle w:val="Compact"/>
         <w:numPr>
           <w:ilvl w:val="0"/>
@@ -410,25 +430,15 @@
         </w:numPr>
       </w:pPr>
       <w:r>
-        <w:rPr>
-          <w:b/>
-          <w:bCs/>
-        </w:rPr>
         <w:t xml:space="preserve">Originated and co-architected</w:t>
       </w:r>
       <w:r>
-        <w:rPr>
-          <w:b/>
-          <w:bCs/>
-        </w:rPr>
         <w:t xml:space="preserve"> </w:t>
       </w:r>
       <w:hyperlink r:id="rId16">
         <w:r>
           <w:rPr>
             <w:rStyle w:val="Hyperlink"/>
-            <w:b/>
-            <w:bCs/>
           </w:rPr>
           <w:t xml:space="preserve">HumaneBench.ai</w:t>
         </w:r>
@@ -436,16 +446,6 @@
       <w:r>
         <w:t xml:space="preserve">, an open-source AI evaluation framework built on AISI Inspect.</w:t>
       </w:r>
-      <w:r>
-        <w:t xml:space="preserve"> </w:t>
-      </w:r>
-      <w:r>
-        <w:rPr>
-          <w:b/>
-          <w:bCs/>
-        </w:rPr>
-        <w:t xml:space="preserve">Python.</w:t>
-      </w:r>
     </w:p>
     <w:p>
       <w:pPr>
@@ -456,23 +456,7 @@
         </w:numPr>
       </w:pPr>
       <w:r>
-        <w:t xml:space="preserve">Acting as</w:t>
-      </w:r>
-      <w:r>
-        <w:t xml:space="preserve"> </w:t>
-      </w:r>
-      <w:r>
-        <w:rPr>
-          <w:b/>
-          <w:bCs/>
-        </w:rPr>
-        <w:t xml:space="preserve">fractional CTO to the team</w:t>
-      </w:r>
-      <w:r>
-        <w:t xml:space="preserve"> </w:t>
-      </w:r>
-      <w:r>
-        <w:t xml:space="preserve">that built it out to a published, externally usable product, shaping architecture, scoring design, and multi-provider support, and guiding documentation and positioning.</w:t>
+        <w:t xml:space="preserve">Fractional CTO to the team that built and maintains it, shaping architecture, scoring design, multi-provider support, documentation, and positioning.</w:t>
       </w:r>
     </w:p>
     <w:p>
@@ -484,52 +468,7 @@
         </w:numPr>
       </w:pPr>
       <w:r>
-        <w:t xml:space="preserve">Extending the framework toward</w:t>
-      </w:r>
-      <w:r>
-        <w:t xml:space="preserve"> </w:t>
-      </w:r>
-      <w:r>
-        <w:rPr>
-          <w:b/>
-          <w:bCs/>
-        </w:rPr>
-        <w:t xml:space="preserve">real-time evaluation</w:t>
-      </w:r>
-      <w:r>
-        <w:t xml:space="preserve">: built a</w:t>
-      </w:r>
-      <w:r>
-        <w:t xml:space="preserve"> </w:t>
-      </w:r>
-      <w:r>
-        <w:rPr>
-          <w:b/>
-          <w:bCs/>
-        </w:rPr>
-        <w:t xml:space="preserve">low-latency proof-of-concept classifier</w:t>
-      </w:r>
-      <w:r>
-        <w:t xml:space="preserve"> </w:t>
-      </w:r>
-      <w:r>
-        <w:t xml:space="preserve">that scores model behavior against HumaneBench rubrics inline at</w:t>
-      </w:r>
-      <w:r>
-        <w:t xml:space="preserve"> </w:t>
-      </w:r>
-      <w:r>
-        <w:rPr>
-          <w:b/>
-          <w:bCs/>
-        </w:rPr>
-        <w:t xml:space="preserve">sub-100ms</w:t>
-      </w:r>
-      <w:r>
-        <w:t xml:space="preserve"> </w:t>
-      </w:r>
-      <w:r>
-        <w:t xml:space="preserve">and can sit in a production request path rather than run only in batch.</w:t>
+        <w:t xml:space="preserve">Designing and building a real-time evaluation classifier that scores AI behavior against those standards inline at sub-100ms.</w:t>
       </w:r>
     </w:p>
     <w:p>
@@ -541,20 +480,7 @@
         </w:numPr>
       </w:pPr>
       <w:r>
-        <w:t xml:space="preserve">Designing</w:t>
-      </w:r>
-      <w:r>
-        <w:t xml:space="preserve"> </w:t>
-      </w:r>
-      <w:r>
-        <w:rPr>
-          <w:b/>
-          <w:bCs/>
-        </w:rPr>
-        <w:t xml:space="preserve">telemetry for operational visibility</w:t>
-      </w:r>
-      <w:r>
-        <w:t xml:space="preserve">, and evaluation feedback loops to inform system-prompt iteration and model fine-tuning.</w:t>
+        <w:t xml:space="preserve">Designing telemetry for operational visibility and evaluation feedback loops.</w:t>
       </w:r>
     </w:p>
     <w:p>
@@ -566,20 +492,7 @@
         </w:numPr>
       </w:pPr>
       <w:r>
-        <w:t xml:space="preserve">Owning</w:t>
-      </w:r>
-      <w:r>
-        <w:t xml:space="preserve"> </w:t>
-      </w:r>
-      <w:r>
-        <w:rPr>
-          <w:b/>
-          <w:bCs/>
-        </w:rPr>
-        <w:t xml:space="preserve">technical product direction and roadmap</w:t>
-      </w:r>
-      <w:r>
-        <w:t xml:space="preserve">: production monitoring, multi-turn evaluation, and adoption maturity models.</w:t>
+        <w:t xml:space="preserve">Curating the technical roadmap: production monitoring, multi-turn evaluation, adoption maturity models.</w:t>
       </w:r>
     </w:p>
     <w:bookmarkEnd w:id="17"/>
@@ -604,6 +517,18 @@
     </w:p>
     <w:p>
       <w:pPr>
+        <w:pStyle w:val="FirstParagraph"/>
+      </w:pPr>
+      <w:r>
+        <w:rPr>
+          <w:i/>
+          <w:iCs/>
+        </w:rPr>
+        <w:t xml:space="preserve">Scope: co-founder; owned front-end and design delivery, including outside design contractors.</w:t>
+      </w:r>
+    </w:p>
+    <w:p>
+      <w:pPr>
         <w:pStyle w:val="Compact"/>
         <w:numPr>
           <w:ilvl w:val="0"/>
@@ -611,7 +536,7 @@
         </w:numPr>
       </w:pPr>
       <w:r>
-        <w:t xml:space="preserve">Owned front-end development: Ruby on Rails views, JavaScript, HTML+CSS, Tailwind, responsive UI/UX.</w:t>
+        <w:t xml:space="preserve">Owned the front end of a production consumer subscription app: Rails views, JavaScript, HTML/CSS, Tailwind, responsive UI/UX.</w:t>
       </w:r>
     </w:p>
     <w:p>
@@ -623,7 +548,7 @@
         </w:numPr>
       </w:pPr>
       <w:r>
-        <w:t xml:space="preserve">Led design and UX delivery, working with freelance designers and translating their designs into the Rails framework.</w:t>
+        <w:t xml:space="preserve">Led design and UX delivery: worked directly with freelance designers, translated Figma into the Rails framework.</w:t>
       </w:r>
     </w:p>
     <w:p>
@@ -635,7 +560,7 @@
         </w:numPr>
       </w:pPr>
       <w:r>
-        <w:t xml:space="preserve">Collaborated on back-end development: Stripe integration, SSO authentication, Rails MVC.</w:t>
+        <w:t xml:space="preserve">Collaborated on the back end: Rails MVC, Stripe subscription billing, SSO authentication.</w:t>
       </w:r>
     </w:p>
     <w:p>
@@ -647,7 +572,7 @@
         </w:numPr>
       </w:pPr>
       <w:r>
-        <w:t xml:space="preserve">Collaborated closely with co-founders on product direction, Figma design, UX, roadmap planning, and prioritization.</w:t>
+        <w:t xml:space="preserve">Partnered with co-founders on product direction, roadmap, and prioritization.</w:t>
       </w:r>
     </w:p>
     <w:bookmarkEnd w:id="19"/>
@@ -672,6 +597,18 @@
     </w:p>
     <w:p>
       <w:pPr>
+        <w:pStyle w:val="FirstParagraph"/>
+      </w:pPr>
+      <w:r>
+        <w:rPr>
+          <w:i/>
+          <w:iCs/>
+        </w:rPr>
+        <w:t xml:space="preserve">Scope: cloud platform serving production customer workloads.</w:t>
+      </w:r>
+    </w:p>
+    <w:p>
+      <w:pPr>
         <w:pStyle w:val="Compact"/>
         <w:numPr>
           <w:ilvl w:val="0"/>
@@ -679,7 +616,7 @@
         </w:numPr>
       </w:pPr>
       <w:r>
-        <w:t xml:space="preserve">Architected and implemented a scalable cloud platform serving customer workloads at a fast-paced startup.</w:t>
+        <w:t xml:space="preserve">Architected and implemented a cloud platform serving customer workloads at an early-stage startup. Python, Pulumi, GCP, GKE, Cloud Run, Helm.</w:t>
       </w:r>
     </w:p>
     <w:p>
@@ -691,7 +628,7 @@
         </w:numPr>
       </w:pPr>
       <w:r>
-        <w:t xml:space="preserve">Built CI/CD patterns including mono-repo conditional workflows, workload identity federation, and continuous delivery.</w:t>
+        <w:t xml:space="preserve">Built CI/CD primitives the rest of engineering used: mono-repo conditional workflows, workload identity federation, continuous delivery.</w:t>
       </w:r>
     </w:p>
     <w:p>
@@ -703,19 +640,7 @@
         </w:numPr>
       </w:pPr>
       <w:r>
-        <w:t xml:space="preserve">Implemented a Slack-based customer support and incident response platform; onboarded teammates and customers.</w:t>
-      </w:r>
-    </w:p>
-    <w:p>
-      <w:pPr>
-        <w:pStyle w:val="Compact"/>
-        <w:numPr>
-          <w:ilvl w:val="0"/>
-          <w:numId w:val="1005"/>
-        </w:numPr>
-      </w:pPr>
-      <w:r>
-        <w:t xml:space="preserve">Python, Pulumi, GCP, GKE, Cloud Run, CircleCI, Helm, SQLMesh.</w:t>
+        <w:t xml:space="preserve">Stood up a customer support and incident response workflow, and onboarded staff and customers onto it.</w:t>
       </w:r>
     </w:p>
     <w:bookmarkEnd w:id="21"/>
@@ -740,6 +665,18 @@
     </w:p>
     <w:p>
       <w:pPr>
+        <w:pStyle w:val="FirstParagraph"/>
+      </w:pPr>
+      <w:r>
+        <w:rPr>
+          <w:i/>
+          <w:iCs/>
+        </w:rPr>
+        <w:t xml:space="preserve">Scope: hired as a Senior Software Engineer, leading teams within a few months, and promoted to Principal for the infrastructure turnaround. Led two engineering teams for close to seven years, including the shared infrastructure platform relied on by every engineering team in the company. Partnered with product, security, and application groups on standards adopted organization-wide.</w:t>
+      </w:r>
+    </w:p>
+    <w:p>
+      <w:pPr>
         <w:pStyle w:val="Compact"/>
         <w:numPr>
           <w:ilvl w:val="0"/>
@@ -751,13 +688,49 @@
           <w:b/>
           <w:bCs/>
         </w:rPr>
-        <w:t xml:space="preserve">M-Bridge Integration Platform</w:t>
+        <w:t xml:space="preserve">Internal Infrastructure Platform</w:t>
       </w:r>
       <w:r>
         <w:t xml:space="preserve"> </w:t>
       </w:r>
       <w:r>
-        <w:t xml:space="preserve">(2 years): Led a team to stabilize and scale an agent-based integration platform handling multi-system data orchestration. Established operational metrics and monitoring that cut error rates roughly 100x. Executed a zero-downtime migration to Kubernetes including relational, document, and cache databases.</w:t>
+        <w:t xml:space="preserve">(4 yrs): Built a new team from scratch whose product was the platform the entire engineering org built on, and ran it as a service org with internal customers: consulted with teams on their workflows, triaged requests, and turned recurring one-off asks into shared primitives and self-serve tooling so teams could ship without waiting on us. Owned the roadmap while staying hands-on in code, architecture, and review.</w:t>
+      </w:r>
+    </w:p>
+    <w:p>
+      <w:pPr>
+        <w:pStyle w:val="Compact"/>
+        <w:numPr>
+          <w:ilvl w:val="0"/>
+          <w:numId w:val="1006"/>
+        </w:numPr>
+      </w:pPr>
+      <w:r>
+        <w:t xml:space="preserve">Led the multi-year modernization of that platform from legacy infrastructure to cloud-native: the whole Rails monolith and its service ecosystem onto Kubernetes with Terraform and Ansible, the primary MySQL database onto RDS, and HashiCorp Vault stood up as an internal secrets service.</w:t>
+      </w:r>
+    </w:p>
+    <w:p>
+      <w:pPr>
+        <w:pStyle w:val="Compact"/>
+        <w:numPr>
+          <w:ilvl w:val="0"/>
+          <w:numId w:val="1006"/>
+        </w:numPr>
+      </w:pPr>
+      <w:r>
+        <w:t xml:space="preserve">Rebuilt the team after mass departures: inherited a one-person DevOps team and rebuilt hiring, onboarding, documentation, and on-call practice into a stable team with strong developer relations.</w:t>
+      </w:r>
+    </w:p>
+    <w:p>
+      <w:pPr>
+        <w:pStyle w:val="Compact"/>
+        <w:numPr>
+          <w:ilvl w:val="0"/>
+          <w:numId w:val="1006"/>
+        </w:numPr>
+      </w:pPr>
+      <w:r>
+        <w:t xml:space="preserve">Led a transition team that took ownership of the BI/analytics pipeline and migrated it to Kubernetes.</w:t>
       </w:r>
     </w:p>
     <w:p>
@@ -773,13 +746,13 @@
           <w:b/>
           <w:bCs/>
         </w:rPr>
-        <w:t xml:space="preserve">Infrastructure Platform</w:t>
+        <w:t xml:space="preserve">M-Bridge Integration Platform</w:t>
       </w:r>
       <w:r>
         <w:t xml:space="preserve"> </w:t>
       </w:r>
       <w:r>
-        <w:t xml:space="preserve">(4 years): Recruited and built a new team from scratch dedicated to the infrastructure platform. Led the organization’s DevOps culture transformation, serving as a change agent and technical authority across engineering. Owned roadmap stewardship, requirements triage, and priority management while staying hands-on with coding, architecture, and code review. Transitioned a large legacy codebase to cloud-native, Infrastructure-as-Code tooling (Terraform, Ansible, Kubernetes).</w:t>
+        <w:t xml:space="preserve">(2.5 yrs): Took over an unreliable agent-based integration platform connecting the SaaS to customer systems (Salesforce, HRIS, accounting) and led its rearchitecture into a dependable one. Cut error rates roughly 100x by instrumenting the system and fixing what the data pointed at. Executed a zero-downtime migration from Heroku to Google Cloud (GKE and Cloud SQL), including relational, document, and cache stores.</w:t>
       </w:r>
     </w:p>
     <w:p>
@@ -791,17 +764,7 @@
         </w:numPr>
       </w:pPr>
       <w:r>
-        <w:rPr>
-          <w:b/>
-          <w:bCs/>
-        </w:rPr>
-        <w:t xml:space="preserve">BI Data Pipeline</w:t>
-      </w:r>
-      <w:r>
-        <w:t xml:space="preserve"> </w:t>
-      </w:r>
-      <w:r>
-        <w:t xml:space="preserve">(3 months): Led a transition team to take ownership of and improve the analytics data pipeline. Migrated the pipeline to Kubernetes.</w:t>
+        <w:t xml:space="preserve">Shipped React features in the customer-facing product and worked in its Redux state management, alongside the platform and infrastructure work.</w:t>
       </w:r>
     </w:p>
     <w:p>
@@ -813,27 +776,7 @@
         </w:numPr>
       </w:pPr>
       <w:r>
-        <w:rPr>
-          <w:b/>
-          <w:bCs/>
-        </w:rPr>
-        <w:t xml:space="preserve">Cross-Functional Impact</w:t>
-      </w:r>
-      <w:r>
-        <w:t xml:space="preserve">: Grew multiple junior engineers into senior SWE and Engineering Manager roles, and mentored engineers across teams. Led interviewing and hiring. Drove organizational change management and process optimization.</w:t>
-      </w:r>
-      <w:r>
-        <w:t xml:space="preserve"> </w:t>
-      </w:r>
-      <w:r>
-        <w:rPr>
-          <w:b/>
-          <w:bCs/>
-        </w:rPr>
-        <w:t xml:space="preserve">Top Performer Award, 2021</w:t>
-      </w:r>
-      <w:r>
-        <w:t xml:space="preserve">.</w:t>
+        <w:t xml:space="preserve">Grew multiple junior engineers into senior SWE and Engineering Manager roles; led interviewing and hiring. Top Performer Award, 2021.</w:t>
       </w:r>
     </w:p>
     <w:bookmarkEnd w:id="23"/>
@@ -865,7 +808,7 @@
         </w:numPr>
       </w:pPr>
       <w:r>
-        <w:t xml:space="preserve">Designed, architected, and built a cross-platform mobile app from scratch (iOS/Android). Node.js backend, JS/Phonegap frontend, Firebase real-time systems, CI/CD to AWS/CloudFront via CircleCI.</w:t>
+        <w:t xml:space="preserve">Designed, architected, and built a cross-platform mobile app from scratch for iOS and Android. Node.js backend, JavaScript frontend with Redux state management, Firebase real-time systems, CI/CD to AWS/CloudFront via CircleCI.</w:t>
       </w:r>
     </w:p>
     <w:p>
@@ -877,19 +820,7 @@
         </w:numPr>
       </w:pPr>
       <w:r>
-        <w:t xml:space="preserve">Established engineering workflow: pair programming, automated testing (Karma/Chai), continuous integration, and rapid deployment processes.</w:t>
-      </w:r>
-    </w:p>
-    <w:p>
-      <w:pPr>
-        <w:pStyle w:val="Compact"/>
-        <w:numPr>
-          <w:ilvl w:val="0"/>
-          <w:numId w:val="1007"/>
-        </w:numPr>
-      </w:pPr>
-      <w:r>
-        <w:t xml:space="preserve">Co-led product strategy, monetization, and launch planning.</w:t>
+        <w:t xml:space="preserve">Established the engineering workflow from nothing (pair programming, automated testing, CI, rapid deployment) and co-led product strategy, monetization, and launch planning.</w:t>
       </w:r>
     </w:p>
     <w:bookmarkEnd w:id="25"/>
@@ -905,102 +836,43 @@
     </w:p>
     <w:p>
       <w:pPr>
-        <w:pStyle w:val="Compact"/>
-        <w:numPr>
-          <w:ilvl w:val="0"/>
-          <w:numId w:val="1008"/>
-        </w:numPr>
+        <w:pStyle w:val="FirstParagraph"/>
+      </w:pPr>
+      <w:r>
+        <w:t xml:space="preserve">Full-stack consulting and lead roles in Ruby on Rails, Node.js, and D3 (OpenTest Pro, Turnbull &amp; Asser e-commerce). Introduced automated testing and CI at OnForce. Architected the initial release of mynewsletterbuilder.com and built its dev team at JBA Network.</w:t>
+      </w:r>
+    </w:p>
+    <w:bookmarkEnd w:id="27"/>
+    <w:bookmarkEnd w:id="28"/>
+    <w:bookmarkStart w:id="31" w:name="open-source-projects"/>
+    <w:p>
+      <w:pPr>
+        <w:pStyle w:val="Heading2"/>
+      </w:pPr>
+      <w:r>
+        <w:t xml:space="preserve">Open Source Projects</w:t>
+      </w:r>
+    </w:p>
+    <w:p>
+      <w:pPr>
+        <w:pStyle w:val="FirstParagraph"/>
       </w:pPr>
       <w:r>
         <w:rPr>
           <w:b/>
           <w:bCs/>
         </w:rPr>
-        <w:t xml:space="preserve">Consultant &amp; Entrepreneur</w:t>
+        <w:t xml:space="preserve">Scan MCP</w:t>
       </w:r>
       <w:r>
         <w:t xml:space="preserve"> </w:t>
       </w:r>
       <w:r>
-        <w:t xml:space="preserve">(2008 - 2014): Founded OpenTest Pro (automated testing education). Built e-commerce ordering system for Turnbull &amp; Asser shirtmakers. Full-stack consulting in Ruby on Rails, Node.js, D3 data visualization. Rapid prototyping and client delivery.</w:t>
-      </w:r>
-    </w:p>
-    <w:p>
-      <w:pPr>
-        <w:pStyle w:val="Compact"/>
-        <w:numPr>
-          <w:ilvl w:val="0"/>
-          <w:numId w:val="1008"/>
-        </w:numPr>
-      </w:pPr>
-      <w:r>
-        <w:rPr>
-          <w:b/>
-          <w:bCs/>
-        </w:rPr>
-        <w:t xml:space="preserve">Web Developer, OnForce, Inc</w:t>
+        <w:t xml:space="preserve">(2024 - Present): MCP server giving AI agents control of document scanners. Privacy-first architecture, device discovery, JSON Schema validation, stdio and HTTP transports. TypeScript/Node.js.</w:t>
       </w:r>
       <w:r>
         <w:t xml:space="preserve"> </w:t>
       </w:r>
-      <w:r>
-        <w:t xml:space="preserve">(2006 - 2007): Introduced automated testing and CI. Built comprehensive API test suite. Integrated platform with Salesforce APIs.</w:t>
-      </w:r>
-    </w:p>
-    <w:p>
-      <w:pPr>
-        <w:pStyle w:val="Compact"/>
-        <w:numPr>
-          <w:ilvl w:val="0"/>
-          <w:numId w:val="1008"/>
-        </w:numPr>
-      </w:pPr>
-      <w:r>
-        <w:rPr>
-          <w:b/>
-          <w:bCs/>
-        </w:rPr>
-        <w:t xml:space="preserve">Development Lead, JBA Network</w:t>
-      </w:r>
-      <w:r>
-        <w:t xml:space="preserve"> </w:t>
-      </w:r>
-      <w:r>
-        <w:t xml:space="preserve">(2003 - 2006): Lead programmer and project manager for mynewsletterbuilder.com. Architected the initial release, then built and scaled the development team.</w:t>
-      </w:r>
-    </w:p>
-    <w:bookmarkEnd w:id="27"/>
-    <w:bookmarkEnd w:id="28"/>
-    <w:bookmarkStart w:id="33" w:name="open-source-projects"/>
-    <w:p>
-      <w:pPr>
-        <w:pStyle w:val="Heading2"/>
-      </w:pPr>
-      <w:r>
-        <w:t xml:space="preserve">Open Source Projects</w:t>
-      </w:r>
-    </w:p>
-    <w:bookmarkStart w:id="30" w:name="scan-mcp-2024---present"/>
-    <w:p>
-      <w:pPr>
-        <w:pStyle w:val="Heading3"/>
-      </w:pPr>
-      <w:r>
-        <w:t xml:space="preserve">Scan MCP (2024 - Present)</w:t>
-      </w:r>
-    </w:p>
-    <w:p>
-      <w:pPr>
-        <w:pStyle w:val="FirstParagraph"/>
-      </w:pPr>
-      <w:r>
-        <w:t xml:space="preserve">MCP (Model Context Protocol) server for scanner automation and document digitization. Privacy-first architecture with smart device discovery, JSON Schema validation, and support for both local stdio and network HTTP transports. TypeScript/Node.js.</w:t>
-      </w:r>
-    </w:p>
-    <w:p>
-      <w:pPr>
-        <w:pStyle w:val="BodyText"/>
-      </w:pPr>
       <w:hyperlink r:id="rId29">
         <w:r>
           <w:rPr>
@@ -1010,29 +882,27 @@
         </w:r>
       </w:hyperlink>
     </w:p>
-    <w:bookmarkEnd w:id="30"/>
-    <w:bookmarkStart w:id="32" w:name="humanebench-2024---present"/>
-    <w:p>
-      <w:pPr>
-        <w:pStyle w:val="Heading3"/>
-      </w:pPr>
-      <w:r>
-        <w:t xml:space="preserve">HumaneBench (2024 - Present)</w:t>
-      </w:r>
-    </w:p>
-    <w:p>
-      <w:pPr>
-        <w:pStyle w:val="FirstParagraph"/>
-      </w:pPr>
-      <w:r>
-        <w:t xml:space="preserve">Evaluation framework for measuring human-friendly behavior in AI assistants, built on AISI Inspect. Tests AI responses across humane technology principles including loneliness, mental health, transparency, and privacy. Supports multiple LLM providers with extensible scenario datasets. Python.</w:t>
-      </w:r>
-    </w:p>
     <w:p>
       <w:pPr>
         <w:pStyle w:val="BodyText"/>
       </w:pPr>
-      <w:hyperlink r:id="rId31">
+      <w:r>
+        <w:rPr>
+          <w:b/>
+          <w:bCs/>
+        </w:rPr>
+        <w:t xml:space="preserve">HumaneBench</w:t>
+      </w:r>
+      <w:r>
+        <w:t xml:space="preserve"> </w:t>
+      </w:r>
+      <w:r>
+        <w:t xml:space="preserve">(2024 - Present): Open-source LLM evaluation framework built on AISI Inspect. See Building Humane Technology above. Python.</w:t>
+      </w:r>
+      <w:r>
+        <w:t xml:space="preserve"> </w:t>
+      </w:r>
+      <w:hyperlink r:id="rId30">
         <w:r>
           <w:rPr>
             <w:rStyle w:val="Hyperlink"/>
@@ -1041,9 +911,8 @@
         </w:r>
       </w:hyperlink>
     </w:p>
-    <w:bookmarkEnd w:id="32"/>
-    <w:bookmarkEnd w:id="33"/>
-    <w:bookmarkStart w:id="34" w:name="skills"/>
+    <w:bookmarkEnd w:id="31"/>
+    <w:bookmarkStart w:id="32" w:name="skills"/>
     <w:p>
       <w:pPr>
         <w:pStyle w:val="Heading2"/>
@@ -1057,7 +926,7 @@
         <w:pStyle w:val="Compact"/>
         <w:numPr>
           <w:ilvl w:val="0"/>
-          <w:numId w:val="1009"/>
+          <w:numId w:val="1008"/>
         </w:numPr>
       </w:pPr>
       <w:r>
@@ -1065,18 +934,18 @@
           <w:b/>
           <w:bCs/>
         </w:rPr>
-        <w:t xml:space="preserve">Languages &amp; Frameworks</w:t>
-      </w:r>
-      <w:r>
-        <w:t xml:space="preserve">: JavaScript, TypeScript, Python, Ruby on Rails, Node.js, Bash.</w:t>
-      </w:r>
-    </w:p>
-    <w:p>
-      <w:pPr>
-        <w:pStyle w:val="Compact"/>
-        <w:numPr>
-          <w:ilvl w:val="0"/>
-          <w:numId w:val="1009"/>
+        <w:t xml:space="preserve">AI/LLM</w:t>
+      </w:r>
+      <w:r>
+        <w:t xml:space="preserve">: LLM evaluation frameworks (AISI Inspect), MCP servers, chatbot development, prompt engineering, context augmentation, agentic coding workflows.</w:t>
+      </w:r>
+    </w:p>
+    <w:p>
+      <w:pPr>
+        <w:pStyle w:val="Compact"/>
+        <w:numPr>
+          <w:ilvl w:val="0"/>
+          <w:numId w:val="1008"/>
         </w:numPr>
       </w:pPr>
       <w:r>
@@ -1084,18 +953,18 @@
           <w:b/>
           <w:bCs/>
         </w:rPr>
-        <w:t xml:space="preserve">Front-end</w:t>
-      </w:r>
-      <w:r>
-        <w:t xml:space="preserve">: React, Vue, HTML, CSS, Tailwind, Responsive Design, UI/UX.</w:t>
-      </w:r>
-    </w:p>
-    <w:p>
-      <w:pPr>
-        <w:pStyle w:val="Compact"/>
-        <w:numPr>
-          <w:ilvl w:val="0"/>
-          <w:numId w:val="1009"/>
+        <w:t xml:space="preserve">Infrastructure &amp; CI/CD</w:t>
+      </w:r>
+      <w:r>
+        <w:t xml:space="preserve">: AWS, GCP, Kubernetes, Docker, Terraform, Pulumi, Ansible, Helm, GitHub Actions, CircleCI, infrastructure as code, automated testing, TDD.</w:t>
+      </w:r>
+    </w:p>
+    <w:p>
+      <w:pPr>
+        <w:pStyle w:val="Compact"/>
+        <w:numPr>
+          <w:ilvl w:val="0"/>
+          <w:numId w:val="1008"/>
         </w:numPr>
       </w:pPr>
       <w:r>
@@ -1103,18 +972,18 @@
           <w:b/>
           <w:bCs/>
         </w:rPr>
-        <w:t xml:space="preserve">Back-end &amp; Data</w:t>
-      </w:r>
-      <w:r>
-        <w:t xml:space="preserve">: API Design, Microservices, Distributed Systems, PostgreSQL, MySQL, MongoDB, Redis.</w:t>
-      </w:r>
-    </w:p>
-    <w:p>
-      <w:pPr>
-        <w:pStyle w:val="Compact"/>
-        <w:numPr>
-          <w:ilvl w:val="0"/>
-          <w:numId w:val="1009"/>
+        <w:t xml:space="preserve">Languages &amp; Frameworks</w:t>
+      </w:r>
+      <w:r>
+        <w:t xml:space="preserve">: Python, TypeScript, JavaScript, React, Vue, Node.js, Ruby on Rails, Bash, HTML, CSS, Tailwind.</w:t>
+      </w:r>
+    </w:p>
+    <w:p>
+      <w:pPr>
+        <w:pStyle w:val="Compact"/>
+        <w:numPr>
+          <w:ilvl w:val="0"/>
+          <w:numId w:val="1008"/>
         </w:numPr>
       </w:pPr>
       <w:r>
@@ -1122,18 +991,18 @@
           <w:b/>
           <w:bCs/>
         </w:rPr>
-        <w:t xml:space="preserve">Cloud &amp; Infrastructure</w:t>
-      </w:r>
-      <w:r>
-        <w:t xml:space="preserve">: AWS, Google Cloud Platform, Kubernetes, Docker, Terraform, Ansible, Pulumi, Helm.</w:t>
-      </w:r>
-    </w:p>
-    <w:p>
-      <w:pPr>
-        <w:pStyle w:val="Compact"/>
-        <w:numPr>
-          <w:ilvl w:val="0"/>
-          <w:numId w:val="1009"/>
+        <w:t xml:space="preserve">Back-end &amp; Data</w:t>
+      </w:r>
+      <w:r>
+        <w:t xml:space="preserve">: API design, microservices, distributed systems, PostgreSQL, MySQL, MongoDB, Redis, Stripe, SSO/auth.</w:t>
+      </w:r>
+    </w:p>
+    <w:p>
+      <w:pPr>
+        <w:pStyle w:val="Compact"/>
+        <w:numPr>
+          <w:ilvl w:val="0"/>
+          <w:numId w:val="1008"/>
         </w:numPr>
       </w:pPr>
       <w:r>
@@ -1141,18 +1010,18 @@
           <w:b/>
           <w:bCs/>
         </w:rPr>
-        <w:t xml:space="preserve">CI/CD &amp; DevOps</w:t>
-      </w:r>
-      <w:r>
-        <w:t xml:space="preserve">: CircleCI, GitHub Actions, Automated Testing, TDD, Infrastructure as Code, Cloud-Native Architecture.</w:t>
-      </w:r>
-    </w:p>
-    <w:p>
-      <w:pPr>
-        <w:pStyle w:val="Compact"/>
-        <w:numPr>
-          <w:ilvl w:val="0"/>
-          <w:numId w:val="1009"/>
+        <w:t xml:space="preserve">Front-end</w:t>
+      </w:r>
+      <w:r>
+        <w:t xml:space="preserve">: responsive design, UI/UX collaboration with designers, Figma handoff.</w:t>
+      </w:r>
+    </w:p>
+    <w:p>
+      <w:pPr>
+        <w:pStyle w:val="Compact"/>
+        <w:numPr>
+          <w:ilvl w:val="0"/>
+          <w:numId w:val="1008"/>
         </w:numPr>
       </w:pPr>
       <w:r>
@@ -1160,10 +1029,38 @@
           <w:b/>
           <w:bCs/>
         </w:rPr>
-        <w:t xml:space="preserve">AI/LLM</w:t>
-      </w:r>
-      <w:r>
-        <w:t xml:space="preserve">: MCP (Model Context Protocol), chatbot development, prompt engineering, tool use, context augmentation, AI-assisted developer workflows.</w:t>
+        <w:t xml:space="preserve">Leadership</w:t>
+      </w:r>
+      <w:r>
+        <w:t xml:space="preserve">: Team building, hiring, coaching and mentoring, roadmap ownership, org change management, stakeholder engagement.</w:t>
+      </w:r>
+    </w:p>
+    <w:bookmarkEnd w:id="32"/>
+    <w:bookmarkStart w:id="35" w:name="education"/>
+    <w:p>
+      <w:pPr>
+        <w:pStyle w:val="Heading2"/>
+      </w:pPr>
+      <w:r>
+        <w:t xml:space="preserve">Education</w:t>
+      </w:r>
+    </w:p>
+    <w:bookmarkStart w:id="34" w:name="X8aa14d071da44b7f3006e1d49a262db674bce64"/>
+    <w:p>
+      <w:pPr>
+        <w:pStyle w:val="Heading3"/>
+      </w:pPr>
+      <w:r>
+        <w:t xml:space="preserve">BA in Mathematics, minor in Computer Science</w:t>
+      </w:r>
+    </w:p>
+    <w:bookmarkStart w:id="33" w:name="Xe220d86d70cd5bf8ee7040adf9411d63a6235ab"/>
+    <w:p>
+      <w:pPr>
+        <w:pStyle w:val="Heading4"/>
+      </w:pPr>
+      <w:r>
+        <w:t xml:space="preserve">University of North Carolina at Asheville | May 2003</w:t>
       </w:r>
     </w:p>
     <w:p>
@@ -1175,65 +1072,18 @@
         </w:numPr>
       </w:pPr>
       <w:r>
-        <w:rPr>
-          <w:b/>
-          <w:bCs/>
-        </w:rPr>
-        <w:t xml:space="preserve">Leadership</w:t>
-      </w:r>
-      <w:r>
-        <w:t xml:space="preserve">: Team Building, Coaching &amp; Mentoring, Cross-Functional Collaboration, Roadmap Ownership, Hiring, Agile/Scrum/Kanban, Change Management.</w:t>
-      </w:r>
-    </w:p>
+        <w:t xml:space="preserve">Graduated with distinction in Mathematics. Undergraduate research in 4D fractals.</w:t>
+      </w:r>
+    </w:p>
+    <w:bookmarkEnd w:id="33"/>
     <w:bookmarkEnd w:id="34"/>
-    <w:bookmarkStart w:id="37" w:name="education"/>
+    <w:bookmarkEnd w:id="35"/>
+    <w:bookmarkStart w:id="36" w:name="recommendations"/>
     <w:p>
       <w:pPr>
         <w:pStyle w:val="Heading2"/>
       </w:pPr>
       <w:r>
-        <w:t xml:space="preserve">Education</w:t>
-      </w:r>
-    </w:p>
-    <w:bookmarkStart w:id="36" w:name="X8aa14d071da44b7f3006e1d49a262db674bce64"/>
-    <w:p>
-      <w:pPr>
-        <w:pStyle w:val="Heading3"/>
-      </w:pPr>
-      <w:r>
-        <w:t xml:space="preserve">BA in Mathematics, minor in Computer Science</w:t>
-      </w:r>
-    </w:p>
-    <w:bookmarkStart w:id="35" w:name="Xe220d86d70cd5bf8ee7040adf9411d63a6235ab"/>
-    <w:p>
-      <w:pPr>
-        <w:pStyle w:val="Heading4"/>
-      </w:pPr>
-      <w:r>
-        <w:t xml:space="preserve">University of North Carolina at Asheville | May 2003</w:t>
-      </w:r>
-    </w:p>
-    <w:p>
-      <w:pPr>
-        <w:pStyle w:val="Compact"/>
-        <w:numPr>
-          <w:ilvl w:val="0"/>
-          <w:numId w:val="1010"/>
-        </w:numPr>
-      </w:pPr>
-      <w:r>
-        <w:t xml:space="preserve">Graduated with distinction in Mathematics. Undergraduate research in 4D fractals.</w:t>
-      </w:r>
-    </w:p>
-    <w:bookmarkEnd w:id="35"/>
-    <w:bookmarkEnd w:id="36"/>
-    <w:bookmarkEnd w:id="37"/>
-    <w:bookmarkStart w:id="38" w:name="recommendations"/>
-    <w:p>
-      <w:pPr>
-        <w:pStyle w:val="Heading2"/>
-      </w:pPr>
-      <w:r>
         <w:t xml:space="preserve">Recommendations</w:t>
       </w:r>
     </w:p>
@@ -1242,104 +1092,7 @@
         <w:pStyle w:val="FirstParagraph"/>
       </w:pPr>
       <w:r>
-        <w:t xml:space="preserve">“Jack is</w:t>
-      </w:r>
-      <w:r>
-        <w:t xml:space="preserve"> </w:t>
-      </w:r>
-      <w:r>
-        <w:rPr>
-          <w:b/>
-          <w:bCs/>
-        </w:rPr>
-        <w:t xml:space="preserve">an exceptional engineer and leader</w:t>
-      </w:r>
-      <w:r>
-        <w:t xml:space="preserve">. He strives to</w:t>
-      </w:r>
-      <w:r>
-        <w:t xml:space="preserve"> </w:t>
-      </w:r>
-      <w:r>
-        <w:rPr>
-          <w:b/>
-          <w:bCs/>
-        </w:rPr>
-        <w:t xml:space="preserve">deeply understand the technology</w:t>
-      </w:r>
-      <w:r>
-        <w:t xml:space="preserve"> </w:t>
-      </w:r>
-      <w:r>
-        <w:t xml:space="preserve">he’s working on while remaining cognizant of the socio-technical components that may be a factor in any project. He’s thorough, detail-oriented, and outcome-oriented, which means</w:t>
-      </w:r>
-      <w:r>
-        <w:t xml:space="preserve"> </w:t>
-      </w:r>
-      <w:r>
-        <w:rPr>
-          <w:b/>
-          <w:bCs/>
-        </w:rPr>
-        <w:t xml:space="preserve">the solutions he architects, builds, and collaborates on come out better</w:t>
-      </w:r>
-      <w:r>
-        <w:t xml:space="preserve">. Jack also strives to be</w:t>
-      </w:r>
-      <w:r>
-        <w:t xml:space="preserve"> </w:t>
-      </w:r>
-      <w:r>
-        <w:rPr>
-          <w:b/>
-          <w:bCs/>
-        </w:rPr>
-        <w:t xml:space="preserve">at the forefront of new technology</w:t>
-      </w:r>
-      <w:r>
-        <w:t xml:space="preserve"> </w:t>
-      </w:r>
-      <w:r>
-        <w:t xml:space="preserve">and assess how he can leverage it. Newer tech like GenAI can be complex and ever-evolving, and</w:t>
-      </w:r>
-      <w:r>
-        <w:t xml:space="preserve"> </w:t>
-      </w:r>
-      <w:r>
-        <w:rPr>
-          <w:b/>
-          <w:bCs/>
-        </w:rPr>
-        <w:t xml:space="preserve">Jack is not one to back down but step up and embrace</w:t>
-      </w:r>
-      <w:r>
-        <w:t xml:space="preserve">. He does all this with a</w:t>
-      </w:r>
-      <w:r>
-        <w:t xml:space="preserve"> </w:t>
-      </w:r>
-      <w:r>
-        <w:rPr>
-          <w:b/>
-          <w:bCs/>
-        </w:rPr>
-        <w:t xml:space="preserve">strong team mentality</w:t>
-      </w:r>
-      <w:r>
-        <w:t xml:space="preserve">, is a phenomenal team player, and can</w:t>
-      </w:r>
-      <w:r>
-        <w:t xml:space="preserve"> </w:t>
-      </w:r>
-      <w:r>
-        <w:rPr>
-          <w:b/>
-          <w:bCs/>
-        </w:rPr>
-        <w:t xml:space="preserve">effectively delegate to help lift others’ skill sets</w:t>
-      </w:r>
-      <w:r>
-        <w:t xml:space="preserve">.”</w:t>
+        <w:t xml:space="preserve">“Jack is an exceptional engineer and leader. He strives to deeply understand the technology he’s working on while remaining cognizant of the socio-technical components that may be a factor in any project. He’s thorough, detail-oriented, and outcome-oriented, which means the solutions he architects, builds, and collaborates on come out better. Jack also strives to be at the forefront of new technology and assess how he can leverage it. Newer tech like GenAI can be complex and ever-evolving, and Jack is not one to back down but step up and embrace. He does all this with a strong team mentality, is a phenomenal team player, and can effectively delegate to help lift others’ skill sets.”</w:t>
       </w:r>
     </w:p>
     <w:p>
@@ -1359,46 +1112,7 @@
         <w:pStyle w:val="BodyText"/>
       </w:pPr>
       <w:r>
-        <w:t xml:space="preserve">“Jack has</w:t>
-      </w:r>
-      <w:r>
-        <w:t xml:space="preserve"> </w:t>
-      </w:r>
-      <w:r>
-        <w:rPr>
-          <w:b/>
-          <w:bCs/>
-        </w:rPr>
-        <w:t xml:space="preserve">had quite a profound impact on my career</w:t>
-      </w:r>
-      <w:r>
-        <w:t xml:space="preserve">. As a young engineer, I was fortunate enough to work with Jack as my coach. He served as a great mentor, helping me build both technical and professional skills and</w:t>
-      </w:r>
-      <w:r>
-        <w:t xml:space="preserve"> </w:t>
-      </w:r>
-      <w:r>
-        <w:rPr>
-          <w:b/>
-          <w:bCs/>
-        </w:rPr>
-        <w:t xml:space="preserve">forming me into the engineer that I am today</w:t>
-      </w:r>
-      <w:r>
-        <w:t xml:space="preserve">. Throughout our time together, Jack was caring and invested in helping me set goals and develop my career.</w:t>
-      </w:r>
-      <w:r>
-        <w:t xml:space="preserve"> </w:t>
-      </w:r>
-      <w:r>
-        <w:rPr>
-          <w:b/>
-          <w:bCs/>
-        </w:rPr>
-        <w:t xml:space="preserve">His mentorship was a key factor in elevating myself from an incoming Junior Engineer to an Engineering Manager</w:t>
-      </w:r>
-      <w:r>
-        <w:t xml:space="preserve">. Jack has a great curiosity and a strong set of technical capabilities that allow him to serve as a great example for others and a key contributor to any team!”</w:t>
+        <w:t xml:space="preserve">“Jack has had quite a profound impact on my career. As a young engineer, I was fortunate enough to work with Jack as my coach. He served as a great mentor, helping me build both technical and professional skills and forming me into the engineer that I am today. Throughout our time together, Jack was caring and invested in helping me set goals and develop my career. His mentorship was a key factor in elevating myself from an incoming Junior Engineer to an Engineering Manager. Jack has a great curiosity and a strong set of technical capabilities that allow him to serve as a great example for others and a key contributor to any team!”</w:t>
       </w:r>
     </w:p>
     <w:p>
@@ -1418,33 +1132,7 @@
         <w:pStyle w:val="BodyText"/>
       </w:pPr>
       <w:r>
-        <w:t xml:space="preserve">“Jack is a fantastic engineer always ready to</w:t>
-      </w:r>
-      <w:r>
-        <w:t xml:space="preserve"> </w:t>
-      </w:r>
-      <w:r>
-        <w:rPr>
-          <w:b/>
-          <w:bCs/>
-        </w:rPr>
-        <w:t xml:space="preserve">help solve problems and more importantly, teach you how to solve them</w:t>
-      </w:r>
-      <w:r>
-        <w:t xml:space="preserve">. He guided me and my team through a bunch of challenging GitOps situations with patience and kindness, leading by example. Always diligent with his work, willing to roll up his sleeves to get things done and</w:t>
-      </w:r>
-      <w:r>
-        <w:t xml:space="preserve"> </w:t>
-      </w:r>
-      <w:r>
-        <w:rPr>
-          <w:b/>
-          <w:bCs/>
-        </w:rPr>
-        <w:t xml:space="preserve">find creative solutions</w:t>
-      </w:r>
-      <w:r>
-        <w:t xml:space="preserve">. Everyone would be lucky to have someone like him in their teams!”</w:t>
+        <w:t xml:space="preserve">“Jack is a fantastic engineer always ready to help solve problems and more importantly, teach you how to solve them. He guided me and my team through a bunch of challenging GitOps situations with patience and kindness, leading by example. Always diligent with his work, willing to roll up his sleeves to get things done and find creative solutions.”</w:t>
       </w:r>
     </w:p>
     <w:p>
@@ -1457,52 +1145,6 @@
           <w:iCs/>
         </w:rPr>
         <w:t xml:space="preserve">— Cesar Palafox Garza, Principal Software Engineer, Kantata</w:t>
-      </w:r>
-    </w:p>
-    <w:p>
-      <w:pPr>
-        <w:pStyle w:val="BodyText"/>
-      </w:pPr>
-      <w:r>
-        <w:t xml:space="preserve">“Jack is</w:t>
-      </w:r>
-      <w:r>
-        <w:t xml:space="preserve"> </w:t>
-      </w:r>
-      <w:r>
-        <w:rPr>
-          <w:b/>
-          <w:bCs/>
-        </w:rPr>
-        <w:t xml:space="preserve">awesome at understanding the direction teams need to go to make important improvements in Kantata’s Engineering organization as a whole</w:t>
-      </w:r>
-      <w:r>
-        <w:t xml:space="preserve">. He has been instrumental in building and implementing strategies to upgrade Ruby, Rails, and React. If I had any questions about infrastructure and Kubernetes he would be able to answer and</w:t>
-      </w:r>
-      <w:r>
-        <w:t xml:space="preserve"> </w:t>
-      </w:r>
-      <w:r>
-        <w:rPr>
-          <w:b/>
-          <w:bCs/>
-        </w:rPr>
-        <w:t xml:space="preserve">provide solid explanations to the entire team</w:t>
-      </w:r>
-      <w:r>
-        <w:t xml:space="preserve">.”</w:t>
-      </w:r>
-    </w:p>
-    <w:p>
-      <w:pPr>
-        <w:pStyle w:val="BodyText"/>
-      </w:pPr>
-      <w:r>
-        <w:rPr>
-          <w:i/>
-          <w:iCs/>
-        </w:rPr>
-        <w:t xml:space="preserve">— Justin Hurstwright, Principal Software Engineer, Kantata</w:t>
       </w:r>
     </w:p>
     <w:p>
@@ -1518,8 +1160,8 @@
         </w:r>
       </w:hyperlink>
     </w:p>
-    <w:bookmarkEnd w:id="38"/>
-    <w:bookmarkEnd w:id="39"/>
+    <w:bookmarkEnd w:id="36"/>
+    <w:bookmarkEnd w:id="37"/>
     <w:sectPr>
       <w:footnotePr>
         <w:numRestart w:val="eachSect"/>
@@ -1761,9 +1403,6 @@
     <w:abstractNumId w:val="991"/>
   </w:num>
   <w:num w:numId="1009">
-    <w:abstractNumId w:val="991"/>
-  </w:num>
-  <w:num w:numId="1010">
     <w:abstractNumId w:val="991"/>
   </w:num>
 </w:numbering>

</xml_diff>